<commit_message>
Enhance field configuration and layout handling in form generator
</commit_message>
<xml_diff>
--- a/template.docx
+++ b/template.docx
@@ -90,8 +90,8 @@
         <w:gridCol w:w="412"/>
         <w:gridCol w:w="1614"/>
         <w:gridCol w:w="241"/>
-        <w:gridCol w:w="378"/>
-        <w:gridCol w:w="2801"/>
+        <w:gridCol w:w="392"/>
+        <w:gridCol w:w="2787"/>
       </w:tblGrid>
       <w:tr>
         <w:trPr>
@@ -1124,13 +1124,6 @@
               </w:rPr>
               <w:t>}}</w:t>
             </w:r>
-            <w:r>
-              <w:rPr>
-                <w:rFonts w:ascii="新細明體" w:hAnsi="新細明體"/>
-                <w:bCs/>
-              </w:rPr>
-              <w:t>}</w:t>
-            </w:r>
           </w:p>
         </w:tc>
       </w:tr>
@@ -3580,7 +3573,21 @@
               <w:rPr>
                 <w:rFonts w:ascii="新細明體" w:hAnsi="新細明體" w:hint="eastAsia"/>
               </w:rPr>
-              <w:t>{{promotionPosterSize}}</w:t>
+              <w:t>{{</w:t>
+            </w:r>
+            <w:proofErr w:type="spellStart"/>
+            <w:r>
+              <w:rPr>
+                <w:rFonts w:ascii="新細明體" w:hAnsi="新細明體" w:hint="eastAsia"/>
+              </w:rPr>
+              <w:t>promotionPosterSize</w:t>
+            </w:r>
+            <w:proofErr w:type="spellEnd"/>
+            <w:r>
+              <w:rPr>
+                <w:rFonts w:ascii="新細明體" w:hAnsi="新細明體" w:hint="eastAsia"/>
+              </w:rPr>
+              <w:t>}}</w:t>
             </w:r>
             <w:r>
               <w:rPr>
@@ -10203,76 +10210,76 @@
       </w:rPr>
     </w:lvl>
   </w:abstractNum>
-  <w:num w:numId="1" w16cid:durableId="176771165">
+  <w:num w:numId="1" w16cid:durableId="2055226516">
     <w:abstractNumId w:val="13"/>
   </w:num>
-  <w:num w:numId="2" w16cid:durableId="1019937656">
+  <w:num w:numId="2" w16cid:durableId="656612102">
     <w:abstractNumId w:val="23"/>
   </w:num>
-  <w:num w:numId="3" w16cid:durableId="1068727588">
+  <w:num w:numId="3" w16cid:durableId="1782450184">
     <w:abstractNumId w:val="17"/>
   </w:num>
-  <w:num w:numId="4" w16cid:durableId="874390723">
+  <w:num w:numId="4" w16cid:durableId="1548568913">
     <w:abstractNumId w:val="37"/>
   </w:num>
-  <w:num w:numId="5" w16cid:durableId="2103377950">
+  <w:num w:numId="5" w16cid:durableId="1589004325">
     <w:abstractNumId w:val="28"/>
   </w:num>
-  <w:num w:numId="6" w16cid:durableId="840895032">
+  <w:num w:numId="6" w16cid:durableId="1831751296">
     <w:abstractNumId w:val="12"/>
   </w:num>
-  <w:num w:numId="7" w16cid:durableId="861632309">
+  <w:num w:numId="7" w16cid:durableId="1350372749">
     <w:abstractNumId w:val="1"/>
   </w:num>
-  <w:num w:numId="8" w16cid:durableId="163671317">
+  <w:num w:numId="8" w16cid:durableId="196428089">
     <w:abstractNumId w:val="43"/>
   </w:num>
-  <w:num w:numId="9" w16cid:durableId="306787919">
+  <w:num w:numId="9" w16cid:durableId="1530530301">
     <w:abstractNumId w:val="4"/>
   </w:num>
-  <w:num w:numId="10" w16cid:durableId="982925127">
+  <w:num w:numId="10" w16cid:durableId="1478650136">
     <w:abstractNumId w:val="39"/>
   </w:num>
-  <w:num w:numId="11" w16cid:durableId="1472136941">
+  <w:num w:numId="11" w16cid:durableId="98766780">
     <w:abstractNumId w:val="25"/>
   </w:num>
-  <w:num w:numId="12" w16cid:durableId="1456413044">
+  <w:num w:numId="12" w16cid:durableId="1598175384">
     <w:abstractNumId w:val="18"/>
   </w:num>
-  <w:num w:numId="13" w16cid:durableId="1069575953">
+  <w:num w:numId="13" w16cid:durableId="1607032446">
     <w:abstractNumId w:val="45"/>
   </w:num>
-  <w:num w:numId="14" w16cid:durableId="1034383194">
+  <w:num w:numId="14" w16cid:durableId="1324356572">
     <w:abstractNumId w:val="31"/>
   </w:num>
-  <w:num w:numId="15" w16cid:durableId="727807475">
+  <w:num w:numId="15" w16cid:durableId="50202509">
     <w:abstractNumId w:val="16"/>
   </w:num>
-  <w:num w:numId="16" w16cid:durableId="1161965713">
+  <w:num w:numId="16" w16cid:durableId="1678196635">
     <w:abstractNumId w:val="24"/>
   </w:num>
-  <w:num w:numId="17" w16cid:durableId="1485048333">
+  <w:num w:numId="17" w16cid:durableId="1808625975">
     <w:abstractNumId w:val="35"/>
   </w:num>
-  <w:num w:numId="18" w16cid:durableId="855315785">
+  <w:num w:numId="18" w16cid:durableId="391202167">
     <w:abstractNumId w:val="38"/>
   </w:num>
-  <w:num w:numId="19" w16cid:durableId="1165318500">
+  <w:num w:numId="19" w16cid:durableId="987514152">
     <w:abstractNumId w:val="32"/>
   </w:num>
-  <w:num w:numId="20" w16cid:durableId="162742968">
+  <w:num w:numId="20" w16cid:durableId="1273584938">
     <w:abstractNumId w:val="36"/>
   </w:num>
-  <w:num w:numId="21" w16cid:durableId="1610967293">
+  <w:num w:numId="21" w16cid:durableId="1401752928">
     <w:abstractNumId w:val="5"/>
   </w:num>
-  <w:num w:numId="22" w16cid:durableId="1974602254">
+  <w:num w:numId="22" w16cid:durableId="1120414839">
     <w:abstractNumId w:val="21"/>
   </w:num>
-  <w:num w:numId="23" w16cid:durableId="1682514638">
+  <w:num w:numId="23" w16cid:durableId="285818116">
     <w:abstractNumId w:val="29"/>
   </w:num>
-  <w:num w:numId="24" w16cid:durableId="2072000217">
+  <w:num w:numId="24" w16cid:durableId="291180656">
     <w:abstractNumId w:val="0"/>
     <w:lvlOverride w:ilvl="0">
       <w:lvl w:ilvl="0">
@@ -10290,73 +10297,73 @@
       </w:lvl>
     </w:lvlOverride>
   </w:num>
-  <w:num w:numId="25" w16cid:durableId="1837114033">
+  <w:num w:numId="25" w16cid:durableId="1316228770">
     <w:abstractNumId w:val="6"/>
   </w:num>
-  <w:num w:numId="26" w16cid:durableId="143545905">
+  <w:num w:numId="26" w16cid:durableId="13189982">
     <w:abstractNumId w:val="11"/>
   </w:num>
-  <w:num w:numId="27" w16cid:durableId="1610316159">
+  <w:num w:numId="27" w16cid:durableId="1042511238">
     <w:abstractNumId w:val="7"/>
   </w:num>
-  <w:num w:numId="28" w16cid:durableId="1324816048">
+  <w:num w:numId="28" w16cid:durableId="1467772812">
     <w:abstractNumId w:val="44"/>
   </w:num>
-  <w:num w:numId="29" w16cid:durableId="497186652">
+  <w:num w:numId="29" w16cid:durableId="496650855">
     <w:abstractNumId w:val="19"/>
   </w:num>
-  <w:num w:numId="30" w16cid:durableId="1245725652">
+  <w:num w:numId="30" w16cid:durableId="289753101">
     <w:abstractNumId w:val="9"/>
   </w:num>
-  <w:num w:numId="31" w16cid:durableId="1872914929">
+  <w:num w:numId="31" w16cid:durableId="1413313685">
     <w:abstractNumId w:val="10"/>
   </w:num>
-  <w:num w:numId="32" w16cid:durableId="203754072">
+  <w:num w:numId="32" w16cid:durableId="1434475372">
     <w:abstractNumId w:val="33"/>
   </w:num>
-  <w:num w:numId="33" w16cid:durableId="180553011">
+  <w:num w:numId="33" w16cid:durableId="374431875">
     <w:abstractNumId w:val="27"/>
   </w:num>
-  <w:num w:numId="34" w16cid:durableId="725907614">
+  <w:num w:numId="34" w16cid:durableId="1552422343">
     <w:abstractNumId w:val="42"/>
   </w:num>
-  <w:num w:numId="35" w16cid:durableId="268051265">
+  <w:num w:numId="35" w16cid:durableId="607085968">
     <w:abstractNumId w:val="22"/>
   </w:num>
-  <w:num w:numId="36" w16cid:durableId="945691646">
+  <w:num w:numId="36" w16cid:durableId="591356179">
     <w:abstractNumId w:val="34"/>
   </w:num>
-  <w:num w:numId="37" w16cid:durableId="561907394">
+  <w:num w:numId="37" w16cid:durableId="1876699208">
     <w:abstractNumId w:val="40"/>
   </w:num>
-  <w:num w:numId="38" w16cid:durableId="1761367562">
+  <w:num w:numId="38" w16cid:durableId="216279114">
     <w:abstractNumId w:val="15"/>
   </w:num>
-  <w:num w:numId="39" w16cid:durableId="15811989">
+  <w:num w:numId="39" w16cid:durableId="1632441888">
     <w:abstractNumId w:val="41"/>
   </w:num>
-  <w:num w:numId="40" w16cid:durableId="837109847">
+  <w:num w:numId="40" w16cid:durableId="2131705773">
     <w:abstractNumId w:val="8"/>
   </w:num>
-  <w:num w:numId="41" w16cid:durableId="14426874">
+  <w:num w:numId="41" w16cid:durableId="297993919">
     <w:abstractNumId w:val="3"/>
   </w:num>
-  <w:num w:numId="42" w16cid:durableId="268123365">
+  <w:num w:numId="42" w16cid:durableId="198014021">
     <w:abstractNumId w:val="20"/>
   </w:num>
-  <w:num w:numId="43" w16cid:durableId="1434279472">
+  <w:num w:numId="43" w16cid:durableId="955988056">
     <w:abstractNumId w:val="26"/>
   </w:num>
-  <w:num w:numId="44" w16cid:durableId="517353114">
+  <w:num w:numId="44" w16cid:durableId="1424303100">
     <w:abstractNumId w:val="30"/>
   </w:num>
-  <w:num w:numId="45" w16cid:durableId="117719861">
+  <w:num w:numId="45" w16cid:durableId="942611396">
     <w:abstractNumId w:val="2"/>
   </w:num>
-  <w:num w:numId="46" w16cid:durableId="324936942">
+  <w:num w:numId="46" w16cid:durableId="1995839431">
     <w:abstractNumId w:val="46"/>
   </w:num>
-  <w:num w:numId="47" w16cid:durableId="1915968942">
+  <w:num w:numId="47" w16cid:durableId="1487895936">
     <w:abstractNumId w:val="14"/>
   </w:num>
 </w:numbering>

</xml_diff>

<commit_message>
Update field labels and download file name for improved clarity
</commit_message>
<xml_diff>
--- a/template.docx
+++ b/template.docx
@@ -85,13 +85,13 @@
       <w:tblGrid>
         <w:gridCol w:w="1204"/>
         <w:gridCol w:w="2591"/>
-        <w:gridCol w:w="240"/>
-        <w:gridCol w:w="167"/>
-        <w:gridCol w:w="412"/>
+        <w:gridCol w:w="526"/>
+        <w:gridCol w:w="213"/>
+        <w:gridCol w:w="528"/>
         <w:gridCol w:w="1614"/>
-        <w:gridCol w:w="241"/>
-        <w:gridCol w:w="392"/>
-        <w:gridCol w:w="2787"/>
+        <w:gridCol w:w="270"/>
+        <w:gridCol w:w="328"/>
+        <w:gridCol w:w="2374"/>
       </w:tblGrid>
       <w:tr>
         <w:trPr>
@@ -136,21 +136,7 @@
               <w:rPr>
                 <w:rFonts w:ascii="新細明體" w:hAnsi="新細明體"/>
               </w:rPr>
-              <w:t>{{</w:t>
-            </w:r>
-            <w:proofErr w:type="spellStart"/>
-            <w:r>
-              <w:rPr>
-                <w:rFonts w:ascii="新細明體" w:hAnsi="新細明體"/>
-              </w:rPr>
-              <w:t>bookTitle</w:t>
-            </w:r>
-            <w:proofErr w:type="spellEnd"/>
-            <w:r>
-              <w:rPr>
-                <w:rFonts w:ascii="新細明體" w:hAnsi="新細明體"/>
-              </w:rPr>
-              <w:t>}}</w:t>
+              <w:t>{{bookTitle}}</w:t>
             </w:r>
           </w:p>
         </w:tc>
@@ -171,21 +157,7 @@
               <w:rPr>
                 <w:rFonts w:ascii="新細明體" w:hAnsi="新細明體" w:hint="eastAsia"/>
               </w:rPr>
-              <w:t>{{</w:t>
-            </w:r>
-            <w:proofErr w:type="spellStart"/>
-            <w:r>
-              <w:rPr>
-                <w:rFonts w:ascii="新細明體" w:hAnsi="新細明體" w:hint="eastAsia"/>
-              </w:rPr>
-              <w:t>bookCover</w:t>
-            </w:r>
-            <w:proofErr w:type="spellEnd"/>
-            <w:r>
-              <w:rPr>
-                <w:rFonts w:ascii="新細明體" w:hAnsi="新細明體" w:hint="eastAsia"/>
-              </w:rPr>
-              <w:t>}}</w:t>
+              <w:t>{{bookCover}}</w:t>
             </w:r>
           </w:p>
         </w:tc>
@@ -233,21 +205,7 @@
               <w:rPr>
                 <w:rFonts w:ascii="新細明體" w:hAnsi="新細明體"/>
               </w:rPr>
-              <w:t>{{</w:t>
-            </w:r>
-            <w:proofErr w:type="spellStart"/>
-            <w:r>
-              <w:rPr>
-                <w:rFonts w:ascii="新細明體" w:hAnsi="新細明體"/>
-              </w:rPr>
-              <w:t>seriesName</w:t>
-            </w:r>
-            <w:proofErr w:type="spellEnd"/>
-            <w:r>
-              <w:rPr>
-                <w:rFonts w:ascii="新細明體" w:hAnsi="新細明體"/>
-              </w:rPr>
-              <w:t>}}</w:t>
+              <w:t>{{seriesName}}</w:t>
             </w:r>
           </w:p>
         </w:tc>
@@ -523,31 +481,7 @@
                 <w:szCs w:val="24"/>
                 <w:lang w:val="x-none" w:eastAsia="zh-TW"/>
               </w:rPr>
-              <w:t>{{</w:t>
-            </w:r>
-            <w:proofErr w:type="spellStart"/>
-            <w:r>
-              <w:rPr>
-                <w:rFonts w:ascii="新細明體" w:eastAsia="新細明體" w:hAnsi="新細明體"/>
-                <w:color w:val="auto"/>
-                <w:kern w:val="2"/>
-                <w:sz w:val="24"/>
-                <w:szCs w:val="24"/>
-                <w:lang w:val="x-none" w:eastAsia="zh-TW"/>
-              </w:rPr>
-              <w:t>isbn</w:t>
-            </w:r>
-            <w:proofErr w:type="spellEnd"/>
-            <w:r>
-              <w:rPr>
-                <w:rFonts w:ascii="新細明體" w:eastAsia="新細明體" w:hAnsi="新細明體"/>
-                <w:color w:val="auto"/>
-                <w:kern w:val="2"/>
-                <w:sz w:val="24"/>
-                <w:szCs w:val="24"/>
-                <w:lang w:val="x-none" w:eastAsia="zh-TW"/>
-              </w:rPr>
-              <w:t>}}</w:t>
+              <w:t>{{isbn}}</w:t>
             </w:r>
           </w:p>
         </w:tc>
@@ -622,53 +556,7 @@
                 <w:szCs w:val="24"/>
                 <w:lang w:val="x-none" w:eastAsia="zh-TW"/>
               </w:rPr>
-              <w:t>港幣</w:t>
-            </w:r>
-            <w:r>
-              <w:rPr>
-                <w:rFonts w:ascii="新細明體" w:eastAsia="新細明體" w:hAnsi="新細明體"/>
-                <w:color w:val="auto"/>
-                <w:kern w:val="2"/>
-                <w:sz w:val="24"/>
-                <w:szCs w:val="24"/>
-                <w:lang w:val="x-none" w:eastAsia="zh-TW"/>
-              </w:rPr>
-              <w:t>{{</w:t>
-            </w:r>
-            <w:proofErr w:type="spellStart"/>
-            <w:r>
-              <w:rPr>
-                <w:rFonts w:ascii="新細明體" w:eastAsia="新細明體" w:hAnsi="新細明體"/>
-                <w:color w:val="auto"/>
-                <w:kern w:val="2"/>
-                <w:sz w:val="24"/>
-                <w:szCs w:val="24"/>
-                <w:lang w:val="x-none" w:eastAsia="zh-TW"/>
-              </w:rPr>
-              <w:t>priceHKD</w:t>
-            </w:r>
-            <w:proofErr w:type="spellEnd"/>
-            <w:r>
-              <w:rPr>
-                <w:rFonts w:ascii="新細明體" w:eastAsia="新細明體" w:hAnsi="新細明體"/>
-                <w:color w:val="auto"/>
-                <w:kern w:val="2"/>
-                <w:sz w:val="24"/>
-                <w:szCs w:val="24"/>
-                <w:lang w:val="x-none" w:eastAsia="zh-TW"/>
-              </w:rPr>
-              <w:t>}}</w:t>
-            </w:r>
-            <w:r>
-              <w:rPr>
-                <w:rFonts w:ascii="新細明體" w:eastAsia="新細明體" w:hAnsi="新細明體"/>
-                <w:color w:val="auto"/>
-                <w:kern w:val="2"/>
-                <w:sz w:val="24"/>
-                <w:szCs w:val="24"/>
-                <w:lang w:val="x-none" w:eastAsia="zh-TW"/>
-              </w:rPr>
-              <w:t>元</w:t>
+              <w:t>{{price}}</w:t>
             </w:r>
           </w:p>
         </w:tc>
@@ -739,7 +627,6 @@
               </w:rPr>
               <w:t>/mm/</w:t>
             </w:r>
-            <w:proofErr w:type="spellStart"/>
             <w:r>
               <w:rPr>
                 <w:rFonts w:ascii="新細明體" w:hAnsi="新細明體" w:cs="Arial"/>
@@ -747,17 +634,7 @@
                 <w:sz w:val="22"/>
                 <w:szCs w:val="18"/>
               </w:rPr>
-              <w:t>yy</w:t>
-            </w:r>
-            <w:proofErr w:type="spellEnd"/>
-            <w:r>
-              <w:rPr>
-                <w:rFonts w:ascii="新細明體" w:hAnsi="新細明體" w:cs="Arial"/>
-                <w:color w:val="FF0000"/>
-                <w:sz w:val="22"/>
-                <w:szCs w:val="18"/>
-              </w:rPr>
-              <w:t>)</w:t>
+              <w:t>yy)</w:t>
             </w:r>
           </w:p>
         </w:tc>
@@ -778,23 +655,7 @@
                 <w:rFonts w:ascii="新細明體" w:hAnsi="新細明體"/>
                 <w:bCs/>
               </w:rPr>
-              <w:t>{{</w:t>
-            </w:r>
-            <w:proofErr w:type="spellStart"/>
-            <w:r>
-              <w:rPr>
-                <w:rFonts w:ascii="新細明體" w:hAnsi="新細明體"/>
-                <w:bCs/>
-              </w:rPr>
-              <w:t>publishDate</w:t>
-            </w:r>
-            <w:proofErr w:type="spellEnd"/>
-            <w:r>
-              <w:rPr>
-                <w:rFonts w:ascii="新細明體" w:hAnsi="新細明體"/>
-                <w:bCs/>
-              </w:rPr>
-              <w:t>}}</w:t>
+              <w:t>{{publishDate}}</w:t>
             </w:r>
           </w:p>
         </w:tc>
@@ -839,23 +700,7 @@
                 <w:rFonts w:ascii="新細明體" w:hAnsi="新細明體"/>
                 <w:bCs/>
               </w:rPr>
-              <w:t>{{</w:t>
-            </w:r>
-            <w:proofErr w:type="spellStart"/>
-            <w:r>
-              <w:rPr>
-                <w:rFonts w:ascii="新細明體" w:hAnsi="新細明體"/>
-                <w:bCs/>
-              </w:rPr>
-              <w:t>moFormat</w:t>
-            </w:r>
-            <w:proofErr w:type="spellEnd"/>
-            <w:r>
-              <w:rPr>
-                <w:rFonts w:ascii="新細明體" w:hAnsi="新細明體"/>
-                <w:bCs/>
-              </w:rPr>
-              <w:t>}}</w:t>
+              <w:t>{{moFormat}}</w:t>
             </w:r>
           </w:p>
         </w:tc>
@@ -898,23 +743,7 @@
                 <w:rFonts w:ascii="新細明體" w:hAnsi="新細明體"/>
                 <w:bCs/>
               </w:rPr>
-              <w:t>{{</w:t>
-            </w:r>
-            <w:proofErr w:type="spellStart"/>
-            <w:r>
-              <w:rPr>
-                <w:rFonts w:ascii="新細明體" w:hAnsi="新細明體"/>
-                <w:bCs/>
-              </w:rPr>
-              <w:t>bookBinding</w:t>
-            </w:r>
-            <w:proofErr w:type="spellEnd"/>
-            <w:r>
-              <w:rPr>
-                <w:rFonts w:ascii="新細明體" w:hAnsi="新細明體"/>
-                <w:bCs/>
-              </w:rPr>
-              <w:t>}}</w:t>
+              <w:t>{{bookBinding}}</w:t>
             </w:r>
           </w:p>
         </w:tc>
@@ -1108,7 +937,6 @@
               </w:rPr>
               <w:t>{{</w:t>
             </w:r>
-            <w:proofErr w:type="spellStart"/>
             <w:r>
               <w:rPr>
                 <w:rFonts w:ascii="新細明體" w:hAnsi="新細明體" w:hint="eastAsia"/>
@@ -1116,7 +944,6 @@
               </w:rPr>
               <w:t>numOfPages</w:t>
             </w:r>
-            <w:proofErr w:type="spellEnd"/>
             <w:r>
               <w:rPr>
                 <w:rFonts w:ascii="新細明體" w:hAnsi="新細明體"/>
@@ -1172,55 +999,7 @@
                 <w:rFonts w:ascii="新細明體" w:hAnsi="新細明體"/>
                 <w:sz w:val="22"/>
               </w:rPr>
-              <w:t>{{</w:t>
-            </w:r>
-            <w:proofErr w:type="spellStart"/>
-            <w:r>
-              <w:rPr>
-                <w:rFonts w:ascii="新細明體" w:hAnsi="新細明體"/>
-                <w:sz w:val="22"/>
-              </w:rPr>
-              <w:t>firstEdition</w:t>
-            </w:r>
-            <w:proofErr w:type="spellEnd"/>
-            <w:r>
-              <w:rPr>
-                <w:rFonts w:ascii="新細明體" w:hAnsi="新細明體"/>
-                <w:sz w:val="22"/>
-              </w:rPr>
-              <w:t>}}初版  {{</w:t>
-            </w:r>
-            <w:proofErr w:type="spellStart"/>
-            <w:r>
-              <w:rPr>
-                <w:rFonts w:ascii="新細明體" w:hAnsi="新細明體"/>
-                <w:sz w:val="22"/>
-              </w:rPr>
-              <w:t>rePrint</w:t>
-            </w:r>
-            <w:proofErr w:type="spellEnd"/>
-            <w:r>
-              <w:rPr>
-                <w:rFonts w:ascii="新細明體" w:hAnsi="新細明體"/>
-                <w:sz w:val="22"/>
-              </w:rPr>
-              <w:t>}}再版  {{</w:t>
-            </w:r>
-            <w:proofErr w:type="spellStart"/>
-            <w:r>
-              <w:rPr>
-                <w:rFonts w:ascii="新細明體" w:hAnsi="新細明體"/>
-                <w:sz w:val="22"/>
-              </w:rPr>
-              <w:t>revisedEdition</w:t>
-            </w:r>
-            <w:proofErr w:type="spellEnd"/>
-            <w:r>
-              <w:rPr>
-                <w:rFonts w:ascii="新細明體" w:hAnsi="新細明體"/>
-                <w:sz w:val="22"/>
-              </w:rPr>
-              <w:t>}}改版</w:t>
+              <w:t>{{firstEdition}}初版  {{rePrint}}再版  {{revisedEdition}}改版</w:t>
             </w:r>
             <w:r>
               <w:rPr>
@@ -1269,23 +1048,7 @@
                 <w:rFonts w:ascii="新細明體" w:hAnsi="新細明體"/>
                 <w:bCs/>
               </w:rPr>
-              <w:t>{{</w:t>
-            </w:r>
-            <w:proofErr w:type="spellStart"/>
-            <w:r>
-              <w:rPr>
-                <w:rFonts w:ascii="新細明體" w:hAnsi="新細明體"/>
-                <w:bCs/>
-              </w:rPr>
-              <w:t>bookColor</w:t>
-            </w:r>
-            <w:proofErr w:type="spellEnd"/>
-            <w:r>
-              <w:rPr>
-                <w:rFonts w:ascii="新細明體" w:hAnsi="新細明體"/>
-                <w:bCs/>
-              </w:rPr>
-              <w:t>}}</w:t>
+              <w:t>{{bookColor}}</w:t>
             </w:r>
           </w:p>
         </w:tc>
@@ -1358,143 +1121,38 @@
                 <w:rFonts w:ascii="新細明體" w:hAnsi="新細明體" w:hint="eastAsia"/>
                 <w:sz w:val="22"/>
               </w:rPr>
-              <w:t>{{</w:t>
-            </w:r>
-            <w:proofErr w:type="spellStart"/>
+              <w:t xml:space="preserve">{{accessoryCD}}CD ROM  {{accessoryAudioCD}}Audio CD {{accessoryMP3CD}}MP3格式C D  {{accessoryDVD}} DVD  {{accessoryGiftCoupon}} 贈品/贈券: </w:t>
+            </w:r>
+            <w:proofErr w:type="gramStart"/>
             <w:r>
               <w:rPr>
                 <w:rFonts w:ascii="新細明體" w:hAnsi="新細明體" w:hint="eastAsia"/>
                 <w:sz w:val="22"/>
               </w:rPr>
-              <w:t>accessoryCD</w:t>
-            </w:r>
-            <w:proofErr w:type="spellEnd"/>
+              <w:t>{{ accessoryGiftCouponText</w:t>
+            </w:r>
+            <w:proofErr w:type="gramEnd"/>
             <w:r>
               <w:rPr>
                 <w:rFonts w:ascii="新細明體" w:hAnsi="新細明體" w:hint="eastAsia"/>
                 <w:sz w:val="22"/>
               </w:rPr>
-              <w:t>}}CD ROM  {{</w:t>
-            </w:r>
-            <w:proofErr w:type="spellStart"/>
-            <w:r>
+              <w:t>}}</w:t>
+            </w:r>
+          </w:p>
+          <w:p>
+            <w:pPr>
               <w:rPr>
                 <w:rFonts w:ascii="新細明體" w:hAnsi="新細明體" w:hint="eastAsia"/>
                 <w:sz w:val="22"/>
               </w:rPr>
-              <w:t>accessoryAudioCD</w:t>
-            </w:r>
-            <w:proofErr w:type="spellEnd"/>
+            </w:pPr>
             <w:r>
               <w:rPr>
                 <w:rFonts w:ascii="新細明體" w:hAnsi="新細明體" w:hint="eastAsia"/>
                 <w:sz w:val="22"/>
               </w:rPr>
-              <w:t>}}Audio CD {{accessoryMP3CD}}MP3格式C D  {{</w:t>
-            </w:r>
-            <w:proofErr w:type="spellStart"/>
-            <w:r>
-              <w:rPr>
-                <w:rFonts w:ascii="新細明體" w:hAnsi="新細明體" w:hint="eastAsia"/>
-                <w:sz w:val="22"/>
-              </w:rPr>
-              <w:t>accessoryDVD</w:t>
-            </w:r>
-            <w:proofErr w:type="spellEnd"/>
-            <w:r>
-              <w:rPr>
-                <w:rFonts w:ascii="新細明體" w:hAnsi="新細明體" w:hint="eastAsia"/>
-                <w:sz w:val="22"/>
-              </w:rPr>
-              <w:t>}} DVD  {{</w:t>
-            </w:r>
-            <w:proofErr w:type="spellStart"/>
-            <w:r>
-              <w:rPr>
-                <w:rFonts w:ascii="新細明體" w:hAnsi="新細明體" w:hint="eastAsia"/>
-                <w:sz w:val="22"/>
-              </w:rPr>
-              <w:t>accessoryGiftCoupon</w:t>
-            </w:r>
-            <w:proofErr w:type="spellEnd"/>
-            <w:r>
-              <w:rPr>
-                <w:rFonts w:ascii="新細明體" w:hAnsi="新細明體" w:hint="eastAsia"/>
-                <w:sz w:val="22"/>
-              </w:rPr>
-              <w:t xml:space="preserve">}} 贈品/贈券: </w:t>
-            </w:r>
-            <w:proofErr w:type="gramStart"/>
-            <w:r>
-              <w:rPr>
-                <w:rFonts w:ascii="新細明體" w:hAnsi="新細明體" w:hint="eastAsia"/>
-                <w:sz w:val="22"/>
-              </w:rPr>
-              <w:t xml:space="preserve">{{ </w:t>
-            </w:r>
-            <w:proofErr w:type="spellStart"/>
-            <w:r>
-              <w:rPr>
-                <w:rFonts w:ascii="新細明體" w:hAnsi="新細明體" w:hint="eastAsia"/>
-                <w:sz w:val="22"/>
-              </w:rPr>
-              <w:t>accessoryGiftCouponText</w:t>
-            </w:r>
-            <w:proofErr w:type="spellEnd"/>
-            <w:proofErr w:type="gramEnd"/>
-            <w:r>
-              <w:rPr>
-                <w:rFonts w:ascii="新細明體" w:hAnsi="新細明體" w:hint="eastAsia"/>
-                <w:sz w:val="22"/>
-              </w:rPr>
-              <w:t>}}</w:t>
-            </w:r>
-          </w:p>
-          <w:p>
-            <w:pPr>
-              <w:rPr>
-                <w:rFonts w:ascii="新細明體" w:hAnsi="新細明體" w:hint="eastAsia"/>
-                <w:sz w:val="22"/>
-              </w:rPr>
-            </w:pPr>
-            <w:r>
-              <w:rPr>
-                <w:rFonts w:ascii="新細明體" w:hAnsi="新細明體" w:hint="eastAsia"/>
-                <w:sz w:val="22"/>
-              </w:rPr>
-              <w:t>{{</w:t>
-            </w:r>
-            <w:proofErr w:type="spellStart"/>
-            <w:r>
-              <w:rPr>
-                <w:rFonts w:ascii="新細明體" w:hAnsi="新細明體" w:hint="eastAsia"/>
-                <w:sz w:val="22"/>
-              </w:rPr>
-              <w:t>accessoryOther</w:t>
-            </w:r>
-            <w:proofErr w:type="spellEnd"/>
-            <w:r>
-              <w:rPr>
-                <w:rFonts w:ascii="新細明體" w:hAnsi="新細明體" w:hint="eastAsia"/>
-                <w:sz w:val="22"/>
-              </w:rPr>
-              <w:t>}}其他: {{</w:t>
-            </w:r>
-            <w:proofErr w:type="spellStart"/>
-            <w:r>
-              <w:rPr>
-                <w:rFonts w:ascii="新細明體" w:hAnsi="新細明體" w:hint="eastAsia"/>
-                <w:sz w:val="22"/>
-              </w:rPr>
-              <w:t>accessoryOtherText</w:t>
-            </w:r>
-            <w:proofErr w:type="spellEnd"/>
-            <w:r>
-              <w:rPr>
-                <w:rFonts w:ascii="新細明體" w:hAnsi="新細明體" w:hint="eastAsia"/>
-                <w:sz w:val="22"/>
-              </w:rPr>
-              <w:t>}}</w:t>
+              <w:t>{{accessoryOther}}其他: {{accessoryOtherText}}</w:t>
             </w:r>
           </w:p>
         </w:tc>
@@ -1542,97 +1200,7 @@
                 <w:bCs/>
                 <w:lang w:val="en-GB"/>
               </w:rPr>
-              <w:t>{{</w:t>
-            </w:r>
-            <w:proofErr w:type="spellStart"/>
-            <w:r>
-              <w:rPr>
-                <w:rFonts w:ascii="新細明體" w:hAnsi="新細明體"/>
-                <w:bCs/>
-                <w:lang w:val="en-GB"/>
-              </w:rPr>
-              <w:t>langChi</w:t>
-            </w:r>
-            <w:proofErr w:type="spellEnd"/>
-            <w:r>
-              <w:rPr>
-                <w:rFonts w:ascii="新細明體" w:hAnsi="新細明體"/>
-                <w:bCs/>
-                <w:lang w:val="en-GB"/>
-              </w:rPr>
-              <w:t>}}中文 ({{</w:t>
-            </w:r>
-            <w:proofErr w:type="spellStart"/>
-            <w:r>
-              <w:rPr>
-                <w:rFonts w:ascii="新細明體" w:hAnsi="新細明體"/>
-                <w:bCs/>
-                <w:lang w:val="en-GB"/>
-              </w:rPr>
-              <w:t>langTradChi</w:t>
-            </w:r>
-            <w:proofErr w:type="spellEnd"/>
-            <w:r>
-              <w:rPr>
-                <w:rFonts w:ascii="新細明體" w:hAnsi="新細明體"/>
-                <w:bCs/>
-                <w:lang w:val="en-GB"/>
-              </w:rPr>
-              <w:t>}}繁體 {{</w:t>
-            </w:r>
-            <w:proofErr w:type="spellStart"/>
-            <w:r>
-              <w:rPr>
-                <w:rFonts w:ascii="新細明體" w:hAnsi="新細明體"/>
-                <w:bCs/>
-                <w:lang w:val="en-GB"/>
-              </w:rPr>
-              <w:t>langSimChi</w:t>
-            </w:r>
-            <w:proofErr w:type="spellEnd"/>
-            <w:r>
-              <w:rPr>
-                <w:rFonts w:ascii="新細明體" w:hAnsi="新細明體"/>
-                <w:bCs/>
-                <w:lang w:val="en-GB"/>
-              </w:rPr>
-              <w:t>}}簡體)   {{</w:t>
-            </w:r>
-            <w:proofErr w:type="spellStart"/>
-            <w:r>
-              <w:rPr>
-                <w:rFonts w:ascii="新細明體" w:hAnsi="新細明體"/>
-                <w:bCs/>
-                <w:lang w:val="en-GB"/>
-              </w:rPr>
-              <w:t>langEng</w:t>
-            </w:r>
-            <w:proofErr w:type="spellEnd"/>
-            <w:r>
-              <w:rPr>
-                <w:rFonts w:ascii="新細明體" w:hAnsi="新細明體"/>
-                <w:bCs/>
-                <w:lang w:val="en-GB"/>
-              </w:rPr>
-              <w:t>}}英文   {{</w:t>
-            </w:r>
-            <w:proofErr w:type="spellStart"/>
-            <w:r>
-              <w:rPr>
-                <w:rFonts w:ascii="新細明體" w:hAnsi="新細明體"/>
-                <w:bCs/>
-                <w:lang w:val="en-GB"/>
-              </w:rPr>
-              <w:t>langChiEng</w:t>
-            </w:r>
-            <w:proofErr w:type="spellEnd"/>
-            <w:r>
-              <w:rPr>
-                <w:rFonts w:ascii="新細明體" w:hAnsi="新細明體"/>
-                <w:bCs/>
-                <w:lang w:val="en-GB"/>
-              </w:rPr>
-              <w:t>}}中英對照</w:t>
+              <w:t>{{langChi}}中文 ({{langTradChi}}繁體 {{langSimChi}}簡體)   {{langEng}}英文   {{langChiEng}}中英對照</w:t>
             </w:r>
             <w:r>
               <w:rPr>
@@ -1688,103 +1256,7 @@
                 <w:rFonts w:ascii="新細明體" w:hAnsi="新細明體"/>
                 <w:sz w:val="22"/>
               </w:rPr>
-              <w:t>{{</w:t>
-            </w:r>
-            <w:proofErr w:type="spellStart"/>
-            <w:r>
-              <w:rPr>
-                <w:rFonts w:ascii="新細明體" w:hAnsi="新細明體"/>
-                <w:sz w:val="22"/>
-              </w:rPr>
-              <w:t>copyrightRegionHongKong</w:t>
-            </w:r>
-            <w:proofErr w:type="spellEnd"/>
-            <w:r>
-              <w:rPr>
-                <w:rFonts w:ascii="新細明體" w:hAnsi="新細明體"/>
-                <w:sz w:val="22"/>
-              </w:rPr>
-              <w:t>}}香港  {{</w:t>
-            </w:r>
-            <w:proofErr w:type="spellStart"/>
-            <w:r>
-              <w:rPr>
-                <w:rFonts w:ascii="新細明體" w:hAnsi="新細明體"/>
-                <w:sz w:val="22"/>
-              </w:rPr>
-              <w:t>copyrightRegionMacau</w:t>
-            </w:r>
-            <w:proofErr w:type="spellEnd"/>
-            <w:r>
-              <w:rPr>
-                <w:rFonts w:ascii="新細明體" w:hAnsi="新細明體"/>
-                <w:sz w:val="22"/>
-              </w:rPr>
-              <w:t>}}澳門  {{</w:t>
-            </w:r>
-            <w:proofErr w:type="spellStart"/>
-            <w:r>
-              <w:rPr>
-                <w:rFonts w:ascii="新細明體" w:hAnsi="新細明體"/>
-                <w:sz w:val="22"/>
-              </w:rPr>
-              <w:t>copyrightRegionChina</w:t>
-            </w:r>
-            <w:proofErr w:type="spellEnd"/>
-            <w:r>
-              <w:rPr>
-                <w:rFonts w:ascii="新細明體" w:hAnsi="新細明體"/>
-                <w:sz w:val="22"/>
-              </w:rPr>
-              <w:t>}}中國  {{</w:t>
-            </w:r>
-            <w:proofErr w:type="spellStart"/>
-            <w:r>
-              <w:rPr>
-                <w:rFonts w:ascii="新細明體" w:hAnsi="新細明體"/>
-                <w:sz w:val="22"/>
-              </w:rPr>
-              <w:t>copyrightRegionTaiwan</w:t>
-            </w:r>
-            <w:proofErr w:type="spellEnd"/>
-            <w:r>
-              <w:rPr>
-                <w:rFonts w:ascii="新細明體" w:hAnsi="新細明體"/>
-                <w:sz w:val="22"/>
-              </w:rPr>
-              <w:t>}}台灣  {{</w:t>
-            </w:r>
-            <w:proofErr w:type="spellStart"/>
-            <w:r>
-              <w:rPr>
-                <w:rFonts w:ascii="新細明體" w:hAnsi="新細明體"/>
-                <w:sz w:val="22"/>
-              </w:rPr>
-              <w:t>copyrightRegionOther</w:t>
-            </w:r>
-            <w:proofErr w:type="spellEnd"/>
-            <w:r>
-              <w:rPr>
-                <w:rFonts w:ascii="新細明體" w:hAnsi="新細明體"/>
-                <w:sz w:val="22"/>
-              </w:rPr>
-              <w:t>}}其他地方：{{</w:t>
-            </w:r>
-            <w:proofErr w:type="spellStart"/>
-            <w:r>
-              <w:rPr>
-                <w:rFonts w:ascii="新細明體" w:hAnsi="新細明體"/>
-                <w:sz w:val="22"/>
-              </w:rPr>
-              <w:t>copyrightRegionOtherText</w:t>
-            </w:r>
-            <w:proofErr w:type="spellEnd"/>
-            <w:r>
-              <w:rPr>
-                <w:rFonts w:ascii="新細明體" w:hAnsi="新細明體"/>
-                <w:sz w:val="22"/>
-              </w:rPr>
-              <w:t>}}</w:t>
+              <w:t>{{copyrightRegionHongKong}}香港  {{copyrightRegionMacau}}澳門  {{copyrightRegionChina}}中國  {{copyrightRegionTaiwan}}台灣  {{copyrightRegionOther}}其他地方：{{copyrightRegionOtherText}}</w:t>
             </w:r>
           </w:p>
         </w:tc>
@@ -1839,9 +1311,8 @@
                 <w:szCs w:val="24"/>
                 <w:lang w:eastAsia="zh-TW"/>
               </w:rPr>
-              <w:t>{{</w:t>
-            </w:r>
-            <w:proofErr w:type="spellStart"/>
+              <w:t>{{bookCategor</w:t>
+            </w:r>
             <w:r>
               <w:rPr>
                 <w:rFonts w:ascii="新細明體" w:eastAsia="新細明體" w:hAnsi="新細明體" w:hint="eastAsia"/>
@@ -1850,19 +1321,8 @@
                 <w:szCs w:val="24"/>
                 <w:lang w:eastAsia="zh-TW"/>
               </w:rPr>
-              <w:t>bookCategor</w:t>
-            </w:r>
-            <w:r>
-              <w:rPr>
-                <w:rFonts w:ascii="新細明體" w:eastAsia="新細明體" w:hAnsi="新細明體" w:hint="eastAsia"/>
-                <w:color w:val="auto"/>
-                <w:sz w:val="24"/>
-                <w:szCs w:val="24"/>
-                <w:lang w:eastAsia="zh-TW"/>
-              </w:rPr>
               <w:t>ies</w:t>
             </w:r>
-            <w:proofErr w:type="spellEnd"/>
             <w:r>
               <w:rPr>
                 <w:rFonts w:ascii="新細明體" w:eastAsia="新細明體" w:hAnsi="新細明體" w:hint="eastAsia"/>
@@ -1923,71 +1383,7 @@
                 <w:rFonts w:ascii="新細明體" w:hAnsi="新細明體" w:hint="eastAsia"/>
                 <w:color w:val="333333"/>
               </w:rPr>
-              <w:t>1.年齡層{{</w:t>
-            </w:r>
-            <w:proofErr w:type="spellStart"/>
-            <w:r>
-              <w:rPr>
-                <w:rFonts w:ascii="新細明體" w:hAnsi="新細明體" w:hint="eastAsia"/>
-                <w:color w:val="333333"/>
-              </w:rPr>
-              <w:t>fromAge</w:t>
-            </w:r>
-            <w:proofErr w:type="spellEnd"/>
-            <w:r>
-              <w:rPr>
-                <w:rFonts w:ascii="新細明體" w:hAnsi="新細明體" w:hint="eastAsia"/>
-                <w:color w:val="333333"/>
-              </w:rPr>
-              <w:t>}}～{{</w:t>
-            </w:r>
-            <w:proofErr w:type="spellStart"/>
-            <w:r>
-              <w:rPr>
-                <w:rFonts w:ascii="新細明體" w:hAnsi="新細明體" w:hint="eastAsia"/>
-                <w:color w:val="333333"/>
-              </w:rPr>
-              <w:t>toAge</w:t>
-            </w:r>
-            <w:proofErr w:type="spellEnd"/>
-            <w:r>
-              <w:rPr>
-                <w:rFonts w:ascii="新細明體" w:hAnsi="新細明體" w:hint="eastAsia"/>
-                <w:color w:val="333333"/>
-              </w:rPr>
-              <w:t>}}歲               2.性別  {{</w:t>
-            </w:r>
-            <w:proofErr w:type="spellStart"/>
-            <w:r>
-              <w:rPr>
-                <w:rFonts w:ascii="新細明體" w:hAnsi="新細明體" w:hint="eastAsia"/>
-                <w:color w:val="333333"/>
-              </w:rPr>
-              <w:t>genderMale</w:t>
-            </w:r>
-            <w:proofErr w:type="spellEnd"/>
-            <w:r>
-              <w:rPr>
-                <w:rFonts w:ascii="新細明體" w:hAnsi="新細明體" w:hint="eastAsia"/>
-                <w:color w:val="333333"/>
-              </w:rPr>
-              <w:t>}}男  {{</w:t>
-            </w:r>
-            <w:proofErr w:type="spellStart"/>
-            <w:r>
-              <w:rPr>
-                <w:rFonts w:ascii="新細明體" w:hAnsi="新細明體" w:hint="eastAsia"/>
-                <w:color w:val="333333"/>
-              </w:rPr>
-              <w:t>genderFemale</w:t>
-            </w:r>
-            <w:proofErr w:type="spellEnd"/>
-            <w:r>
-              <w:rPr>
-                <w:rFonts w:ascii="新細明體" w:hAnsi="新細明體" w:hint="eastAsia"/>
-                <w:color w:val="333333"/>
-              </w:rPr>
-              <w:t>}}女 居多</w:t>
+              <w:t>1.年齡層{{fromAge}}～{{toAge}}歲               2.性別  {{genderMale}}男  {{genderFemale}}女 居多</w:t>
             </w:r>
           </w:p>
           <w:p>
@@ -2003,103 +1399,7 @@
                 <w:rFonts w:ascii="新細明體" w:hAnsi="新細明體" w:hint="eastAsia"/>
                 <w:color w:val="333333"/>
               </w:rPr>
-              <w:t>3.讀者對象： {{</w:t>
-            </w:r>
-            <w:proofErr w:type="spellStart"/>
-            <w:r>
-              <w:rPr>
-                <w:rFonts w:ascii="新細明體" w:hAnsi="新細明體" w:hint="eastAsia"/>
-                <w:color w:val="333333"/>
-              </w:rPr>
-              <w:t>audienceInfants</w:t>
-            </w:r>
-            <w:proofErr w:type="spellEnd"/>
-            <w:r>
-              <w:rPr>
-                <w:rFonts w:ascii="新細明體" w:hAnsi="新細明體" w:hint="eastAsia"/>
-                <w:color w:val="333333"/>
-              </w:rPr>
-              <w:t>}}幼兒{{</w:t>
-            </w:r>
-            <w:proofErr w:type="spellStart"/>
-            <w:r>
-              <w:rPr>
-                <w:rFonts w:ascii="新細明體" w:hAnsi="新細明體" w:hint="eastAsia"/>
-                <w:color w:val="333333"/>
-              </w:rPr>
-              <w:t>audiencePrimarySchoolStudents</w:t>
-            </w:r>
-            <w:proofErr w:type="spellEnd"/>
-            <w:r>
-              <w:rPr>
-                <w:rFonts w:ascii="新細明體" w:hAnsi="新細明體" w:hint="eastAsia"/>
-                <w:color w:val="333333"/>
-              </w:rPr>
-              <w:t>}}小學生{{</w:t>
-            </w:r>
-            <w:proofErr w:type="spellStart"/>
-            <w:r>
-              <w:rPr>
-                <w:rFonts w:ascii="新細明體" w:hAnsi="新細明體" w:hint="eastAsia"/>
-                <w:color w:val="333333"/>
-              </w:rPr>
-              <w:t>audienceSecondaryUniversityStudents</w:t>
-            </w:r>
-            <w:proofErr w:type="spellEnd"/>
-            <w:r>
-              <w:rPr>
-                <w:rFonts w:ascii="新細明體" w:hAnsi="新細明體" w:hint="eastAsia"/>
-                <w:color w:val="333333"/>
-              </w:rPr>
-              <w:t>}}中、大學生 {{</w:t>
-            </w:r>
-            <w:proofErr w:type="spellStart"/>
-            <w:r>
-              <w:rPr>
-                <w:rFonts w:ascii="新細明體" w:hAnsi="新細明體" w:hint="eastAsia"/>
-                <w:color w:val="333333"/>
-              </w:rPr>
-              <w:t>audienceParents</w:t>
-            </w:r>
-            <w:proofErr w:type="spellEnd"/>
-            <w:r>
-              <w:rPr>
-                <w:rFonts w:ascii="新細明體" w:hAnsi="新細明體" w:hint="eastAsia"/>
-                <w:color w:val="333333"/>
-              </w:rPr>
-              <w:t>}}家長 {{</w:t>
-            </w:r>
-            <w:proofErr w:type="spellStart"/>
-            <w:r>
-              <w:rPr>
-                <w:rFonts w:ascii="新細明體" w:hAnsi="新細明體" w:hint="eastAsia"/>
-                <w:color w:val="333333"/>
-              </w:rPr>
-              <w:t>audienceWorks</w:t>
-            </w:r>
-            <w:proofErr w:type="spellEnd"/>
-            <w:r>
-              <w:rPr>
-                <w:rFonts w:ascii="新細明體" w:hAnsi="新細明體" w:hint="eastAsia"/>
-                <w:color w:val="333333"/>
-              </w:rPr>
-              <w:t>}}上班族 {{</w:t>
-            </w:r>
-            <w:proofErr w:type="spellStart"/>
-            <w:r>
-              <w:rPr>
-                <w:rFonts w:ascii="新細明體" w:hAnsi="新細明體" w:hint="eastAsia"/>
-                <w:color w:val="333333"/>
-              </w:rPr>
-              <w:t>audienceGeneralPublic</w:t>
-            </w:r>
-            <w:proofErr w:type="spellEnd"/>
-            <w:r>
-              <w:rPr>
-                <w:rFonts w:ascii="新細明體" w:hAnsi="新細明體" w:hint="eastAsia"/>
-                <w:color w:val="333333"/>
-              </w:rPr>
-              <w:t>}}一般大眾</w:t>
+              <w:t>3.讀者對象： {{audienceInfants}}幼兒{{audiencePrimarySchoolStudents}}小學生{{audienceSecondaryUniversityStudents}}中、大學生 {{audienceParents}}家長 {{audienceWorks}}上班族 {{audienceGeneralPublic}}一般大眾</w:t>
             </w:r>
           </w:p>
           <w:p>
@@ -2115,55 +1415,7 @@
                 <w:rFonts w:ascii="新細明體" w:hAnsi="新細明體" w:hint="eastAsia"/>
                 <w:color w:val="333333"/>
               </w:rPr>
-              <w:t>{{</w:t>
-            </w:r>
-            <w:proofErr w:type="spellStart"/>
-            <w:r>
-              <w:rPr>
-                <w:rFonts w:ascii="新細明體" w:hAnsi="新細明體" w:hint="eastAsia"/>
-                <w:color w:val="333333"/>
-              </w:rPr>
-              <w:t>audienceProfessional</w:t>
-            </w:r>
-            <w:proofErr w:type="spellEnd"/>
-            <w:r>
-              <w:rPr>
-                <w:rFonts w:ascii="新細明體" w:hAnsi="新細明體" w:hint="eastAsia"/>
-                <w:color w:val="333333"/>
-              </w:rPr>
-              <w:t>}}專業人士  {{</w:t>
-            </w:r>
-            <w:proofErr w:type="spellStart"/>
-            <w:r>
-              <w:rPr>
-                <w:rFonts w:ascii="新細明體" w:hAnsi="新細明體" w:hint="eastAsia"/>
-                <w:color w:val="333333"/>
-              </w:rPr>
-              <w:t>audienceOther</w:t>
-            </w:r>
-            <w:proofErr w:type="spellEnd"/>
-            <w:r>
-              <w:rPr>
-                <w:rFonts w:ascii="新細明體" w:hAnsi="新細明體" w:hint="eastAsia"/>
-                <w:color w:val="333333"/>
-              </w:rPr>
-              <w:t>}}其他及補充 {{</w:t>
-            </w:r>
-            <w:proofErr w:type="spellStart"/>
-            <w:r>
-              <w:rPr>
-                <w:rFonts w:ascii="新細明體" w:hAnsi="新細明體" w:hint="eastAsia"/>
-                <w:color w:val="333333"/>
-              </w:rPr>
-              <w:t>audienceOtherText</w:t>
-            </w:r>
-            <w:proofErr w:type="spellEnd"/>
-            <w:r>
-              <w:rPr>
-                <w:rFonts w:ascii="新細明體" w:hAnsi="新細明體" w:hint="eastAsia"/>
-                <w:color w:val="333333"/>
-              </w:rPr>
-              <w:t>}}</w:t>
+              <w:t>{{audienceProfessional}}專業人士  {{audienceOther}}其他及補充 {{audienceOtherText}}</w:t>
             </w:r>
           </w:p>
           <w:p>
@@ -2180,23 +1432,7 @@
                 <w:rFonts w:ascii="新細明體" w:hAnsi="新細明體" w:hint="eastAsia"/>
                 <w:color w:val="333333"/>
               </w:rPr>
-              <w:t>4.購買對象（如有別於讀者對象）:  {{</w:t>
-            </w:r>
-            <w:proofErr w:type="spellStart"/>
-            <w:r>
-              <w:rPr>
-                <w:rFonts w:ascii="新細明體" w:hAnsi="新細明體" w:hint="eastAsia"/>
-                <w:color w:val="333333"/>
-              </w:rPr>
-              <w:t>buyAudience</w:t>
-            </w:r>
-            <w:proofErr w:type="spellEnd"/>
-            <w:r>
-              <w:rPr>
-                <w:rFonts w:ascii="新細明體" w:hAnsi="新細明體" w:hint="eastAsia"/>
-                <w:color w:val="333333"/>
-              </w:rPr>
-              <w:t>}}</w:t>
+              <w:t>4.購買對象（如有別於讀者對象）:  {{buyAudience}}</w:t>
             </w:r>
           </w:p>
         </w:tc>
@@ -2244,71 +1480,7 @@
                 <w:rFonts w:ascii="新細明體" w:hAnsi="新細明體" w:hint="eastAsia"/>
                 <w:sz w:val="22"/>
               </w:rPr>
-              <w:t>{{</w:t>
-            </w:r>
-            <w:proofErr w:type="spellStart"/>
-            <w:r>
-              <w:rPr>
-                <w:rFonts w:ascii="新細明體" w:hAnsi="新細明體" w:hint="eastAsia"/>
-                <w:sz w:val="22"/>
-              </w:rPr>
-              <w:t>salesChannelChiBookStore</w:t>
-            </w:r>
-            <w:proofErr w:type="spellEnd"/>
-            <w:r>
-              <w:rPr>
-                <w:rFonts w:ascii="新細明體" w:hAnsi="新細明體" w:hint="eastAsia"/>
-                <w:sz w:val="22"/>
-              </w:rPr>
-              <w:t>}}中文書店  {{</w:t>
-            </w:r>
-            <w:proofErr w:type="spellStart"/>
-            <w:r>
-              <w:rPr>
-                <w:rFonts w:ascii="新細明體" w:hAnsi="新細明體" w:hint="eastAsia"/>
-                <w:sz w:val="22"/>
-              </w:rPr>
-              <w:t>salesChannelEngBookStore</w:t>
-            </w:r>
-            <w:proofErr w:type="spellEnd"/>
-            <w:r>
-              <w:rPr>
-                <w:rFonts w:ascii="新細明體" w:hAnsi="新細明體" w:hint="eastAsia"/>
-                <w:sz w:val="22"/>
-              </w:rPr>
-              <w:t>}}英文書店  {{salesChannel2ndFloorBookStore}}二樓書店  {{</w:t>
-            </w:r>
-            <w:proofErr w:type="spellStart"/>
-            <w:r>
-              <w:rPr>
-                <w:rFonts w:ascii="新細明體" w:hAnsi="新細明體" w:hint="eastAsia"/>
-                <w:sz w:val="22"/>
-              </w:rPr>
-              <w:t>salesChannelTextBookStore</w:t>
-            </w:r>
-            <w:proofErr w:type="spellEnd"/>
-            <w:r>
-              <w:rPr>
-                <w:rFonts w:ascii="新細明體" w:hAnsi="新細明體" w:hint="eastAsia"/>
-                <w:sz w:val="22"/>
-              </w:rPr>
-              <w:t>}}教科書書店  {{</w:t>
-            </w:r>
-            <w:proofErr w:type="spellStart"/>
-            <w:r>
-              <w:rPr>
-                <w:rFonts w:ascii="新細明體" w:hAnsi="新細明體" w:hint="eastAsia"/>
-                <w:sz w:val="22"/>
-              </w:rPr>
-              <w:t>salesChannelDepartmentStore</w:t>
-            </w:r>
-            <w:proofErr w:type="spellEnd"/>
-            <w:r>
-              <w:rPr>
-                <w:rFonts w:ascii="新細明體" w:hAnsi="新細明體" w:hint="eastAsia"/>
-                <w:sz w:val="22"/>
-              </w:rPr>
-              <w:t>}}百貨公司</w:t>
+              <w:t>{{salesChannelChiBookStore}}中文書店  {{salesChannelEngBookStore}}英文書店  {{salesChannel2ndFloorBookStore}}二樓書店  {{salesChannelTextBookStore}}教科書書店  {{salesChannelDepartmentStore}}百貨公司</w:t>
             </w:r>
           </w:p>
           <w:p>
@@ -2324,72 +1496,15 @@
                 <w:rFonts w:ascii="新細明體" w:hAnsi="新細明體" w:hint="eastAsia"/>
                 <w:sz w:val="22"/>
               </w:rPr>
+              <w:t xml:space="preserve">{{salesChannelSchool}}學校直銷  {{salesChannelConvenienceStore}}便利店    </w:t>
+            </w:r>
+            <w:r>
+              <w:rPr>
+                <w:rFonts w:ascii="新細明體" w:hAnsi="新細明體" w:hint="eastAsia"/>
+                <w:sz w:val="22"/>
+              </w:rPr>
               <w:lastRenderedPageBreak/>
-              <w:t>{{</w:t>
-            </w:r>
-            <w:proofErr w:type="spellStart"/>
-            <w:r>
-              <w:rPr>
-                <w:rFonts w:ascii="新細明體" w:hAnsi="新細明體" w:hint="eastAsia"/>
-                <w:sz w:val="22"/>
-              </w:rPr>
-              <w:t>salesChannelSchool</w:t>
-            </w:r>
-            <w:proofErr w:type="spellEnd"/>
-            <w:r>
-              <w:rPr>
-                <w:rFonts w:ascii="新細明體" w:hAnsi="新細明體" w:hint="eastAsia"/>
-                <w:sz w:val="22"/>
-              </w:rPr>
-              <w:t>}}學校直銷  {{</w:t>
-            </w:r>
-            <w:proofErr w:type="spellStart"/>
-            <w:r>
-              <w:rPr>
-                <w:rFonts w:ascii="新細明體" w:hAnsi="新細明體" w:hint="eastAsia"/>
-                <w:sz w:val="22"/>
-              </w:rPr>
-              <w:t>salesChannelConvenienceStore</w:t>
-            </w:r>
-            <w:proofErr w:type="spellEnd"/>
-            <w:r>
-              <w:rPr>
-                <w:rFonts w:ascii="新細明體" w:hAnsi="新細明體" w:hint="eastAsia"/>
-                <w:sz w:val="22"/>
-              </w:rPr>
-              <w:t>}}便利店    {{</w:t>
-            </w:r>
-            <w:proofErr w:type="spellStart"/>
-            <w:r>
-              <w:rPr>
-                <w:rFonts w:ascii="新細明體" w:hAnsi="新細明體" w:hint="eastAsia"/>
-                <w:sz w:val="22"/>
-              </w:rPr>
-              <w:t>salesChannelProfessionalAssociation</w:t>
-            </w:r>
-            <w:proofErr w:type="spellEnd"/>
-            <w:r>
-              <w:rPr>
-                <w:rFonts w:ascii="新細明體" w:hAnsi="新細明體" w:hint="eastAsia"/>
-                <w:sz w:val="22"/>
-              </w:rPr>
-              <w:t>}}專業團體直銷  {{</w:t>
-            </w:r>
-            <w:proofErr w:type="spellStart"/>
-            <w:r>
-              <w:rPr>
-                <w:rFonts w:ascii="新細明體" w:hAnsi="新細明體" w:hint="eastAsia"/>
-                <w:sz w:val="22"/>
-              </w:rPr>
-              <w:t>salesChannelLibrary</w:t>
-            </w:r>
-            <w:proofErr w:type="spellEnd"/>
-            <w:r>
-              <w:rPr>
-                <w:rFonts w:ascii="新細明體" w:hAnsi="新細明體" w:hint="eastAsia"/>
-                <w:sz w:val="22"/>
-              </w:rPr>
-              <w:t>}}圖書館</w:t>
+              <w:t>{{salesChannelProfessionalAssociation}}專業團體直銷  {{salesChannelLibrary}}圖書館</w:t>
             </w:r>
           </w:p>
         </w:tc>
@@ -2438,24 +1553,15 @@
                 <w:rFonts w:ascii="新細明體" w:hAnsi="新細明體"/>
                 <w:sz w:val="22"/>
               </w:rPr>
-              <w:t>{{</w:t>
-            </w:r>
-            <w:proofErr w:type="spellStart"/>
-            <w:r>
-              <w:rPr>
-                <w:rFonts w:ascii="新細明體" w:hAnsi="新細明體"/>
+              <w:t>{{relatedBookTitle</w:t>
+            </w:r>
+            <w:r>
+              <w:rPr>
+                <w:rFonts w:ascii="新細明體" w:hAnsi="新細明體" w:hint="eastAsia"/>
                 <w:sz w:val="22"/>
               </w:rPr>
-              <w:t>relatedBookTitle</w:t>
-            </w:r>
-            <w:r>
-              <w:rPr>
-                <w:rFonts w:ascii="新細明體" w:hAnsi="新細明體" w:hint="eastAsia"/>
-                <w:sz w:val="22"/>
-              </w:rPr>
               <w:t>s</w:t>
             </w:r>
-            <w:proofErr w:type="spellEnd"/>
             <w:r>
               <w:rPr>
                 <w:rFonts w:ascii="新細明體" w:hAnsi="新細明體"/>
@@ -2584,23 +1690,7 @@
                 <w:rFonts w:ascii="新細明體" w:hAnsi="新細明體"/>
                 <w:bCs/>
               </w:rPr>
-              <w:t>{{</w:t>
-            </w:r>
-            <w:proofErr w:type="spellStart"/>
-            <w:r>
-              <w:rPr>
-                <w:rFonts w:ascii="新細明體" w:hAnsi="新細明體"/>
-                <w:bCs/>
-              </w:rPr>
-              <w:t>bookIntro</w:t>
-            </w:r>
-            <w:proofErr w:type="spellEnd"/>
-            <w:r>
-              <w:rPr>
-                <w:rFonts w:ascii="新細明體" w:hAnsi="新細明體"/>
-                <w:bCs/>
-              </w:rPr>
-              <w:t>}}</w:t>
+              <w:t>{{bookIntro}}</w:t>
             </w:r>
           </w:p>
         </w:tc>
@@ -2691,23 +1781,7 @@
                 <w:rFonts w:ascii="新細明體" w:hAnsi="新細明體"/>
                 <w:bCs/>
               </w:rPr>
-              <w:t>{{</w:t>
-            </w:r>
-            <w:proofErr w:type="spellStart"/>
-            <w:r>
-              <w:rPr>
-                <w:rFonts w:ascii="新細明體" w:hAnsi="新細明體"/>
-                <w:bCs/>
-              </w:rPr>
-              <w:t>bookHighlights</w:t>
-            </w:r>
-            <w:proofErr w:type="spellEnd"/>
-            <w:r>
-              <w:rPr>
-                <w:rFonts w:ascii="新細明體" w:hAnsi="新細明體"/>
-                <w:bCs/>
-              </w:rPr>
-              <w:t>}}</w:t>
+              <w:t>{{bookHighlights}}</w:t>
             </w:r>
           </w:p>
         </w:tc>
@@ -2757,7 +1831,6 @@
               </w:rPr>
               <w:t>{{</w:t>
             </w:r>
-            <w:proofErr w:type="spellStart"/>
             <w:r>
               <w:rPr>
                 <w:rFonts w:ascii="新細明體" w:hAnsi="新細明體" w:hint="eastAsia"/>
@@ -2765,7 +1838,6 @@
               </w:rPr>
               <w:t>authorIntro</w:t>
             </w:r>
-            <w:proofErr w:type="spellEnd"/>
             <w:r>
               <w:rPr>
                 <w:rFonts w:ascii="新細明體" w:hAnsi="新細明體"/>
@@ -2977,7 +2049,7 @@
                 <w:rFonts w:ascii="新細明體" w:hAnsi="新細明體"/>
                 <w:lang w:val="en-GB"/>
               </w:rPr>
-              <w:t>{{competitorBookPriceHKD</w:t>
+              <w:t>{{competitorBookPrice</w:t>
             </w:r>
             <w:r>
               <w:rPr>
@@ -3107,7 +2179,7 @@
                 <w:rFonts w:ascii="新細明體" w:hAnsi="新細明體"/>
                 <w:lang w:val="en-GB"/>
               </w:rPr>
-              <w:t>{{competitorBookPriceHKD</w:t>
+              <w:t>{{competitorBookPrice</w:t>
             </w:r>
             <w:r>
               <w:rPr>
@@ -3237,7 +2309,7 @@
                 <w:rFonts w:ascii="新細明體" w:hAnsi="新細明體"/>
                 <w:lang w:val="en-GB"/>
               </w:rPr>
-              <w:t>{{competitorBookPriceHKD</w:t>
+              <w:t>{{competitorBookPrice</w:t>
             </w:r>
             <w:r>
               <w:rPr>
@@ -3367,7 +2439,7 @@
                 <w:rFonts w:ascii="新細明體" w:hAnsi="新細明體"/>
                 <w:lang w:val="en-GB"/>
               </w:rPr>
-              <w:t>{{competitorBookPriceHKD</w:t>
+              <w:t>{{competitorBookPrice</w:t>
             </w:r>
             <w:r>
               <w:rPr>
@@ -3484,23 +2556,7 @@
                 <w:rFonts w:ascii="新細明體" w:hAnsi="新細明體"/>
                 <w:bCs/>
               </w:rPr>
-              <w:t>{{</w:t>
-            </w:r>
-            <w:proofErr w:type="spellStart"/>
-            <w:r>
-              <w:rPr>
-                <w:rFonts w:ascii="新細明體" w:hAnsi="新細明體"/>
-                <w:bCs/>
-              </w:rPr>
-              <w:t>marketingCampaign</w:t>
-            </w:r>
-            <w:proofErr w:type="spellEnd"/>
-            <w:r>
-              <w:rPr>
-                <w:rFonts w:ascii="新細明體" w:hAnsi="新細明體"/>
-                <w:bCs/>
-              </w:rPr>
-              <w:t>}}</w:t>
+              <w:t>{{marketingCampaign}}</w:t>
             </w:r>
           </w:p>
         </w:tc>
@@ -3553,41 +2609,13 @@
               <w:rPr>
                 <w:rFonts w:ascii="新細明體" w:hAnsi="新細明體" w:hint="eastAsia"/>
               </w:rPr>
-              <w:t>{{</w:t>
-            </w:r>
-            <w:proofErr w:type="spellStart"/>
-            <w:r>
-              <w:rPr>
-                <w:rFonts w:ascii="新細明體" w:hAnsi="新細明體" w:hint="eastAsia"/>
-              </w:rPr>
-              <w:t>promotionPoster</w:t>
-            </w:r>
-            <w:proofErr w:type="spellEnd"/>
-            <w:r>
-              <w:rPr>
-                <w:rFonts w:ascii="新細明體" w:hAnsi="新細明體" w:hint="eastAsia"/>
-              </w:rPr>
-              <w:t>}}海報 (尺寸：</w:t>
-            </w:r>
-            <w:r>
-              <w:rPr>
-                <w:rFonts w:ascii="新細明體" w:hAnsi="新細明體" w:hint="eastAsia"/>
-              </w:rPr>
-              <w:t>{{</w:t>
-            </w:r>
-            <w:proofErr w:type="spellStart"/>
-            <w:r>
-              <w:rPr>
-                <w:rFonts w:ascii="新細明體" w:hAnsi="新細明體" w:hint="eastAsia"/>
-              </w:rPr>
-              <w:t>promotionPosterSize</w:t>
-            </w:r>
-            <w:proofErr w:type="spellEnd"/>
-            <w:r>
-              <w:rPr>
-                <w:rFonts w:ascii="新細明體" w:hAnsi="新細明體" w:hint="eastAsia"/>
-              </w:rPr>
-              <w:t>}}</w:t>
+              <w:t>{{promotionPoster}}海報 (尺寸：</w:t>
+            </w:r>
+            <w:r>
+              <w:rPr>
+                <w:rFonts w:ascii="新細明體" w:hAnsi="新細明體" w:hint="eastAsia"/>
+              </w:rPr>
+              <w:t>{{promotionPosterSize}}</w:t>
             </w:r>
             <w:r>
               <w:rPr>
@@ -3606,35 +2634,7 @@
               <w:rPr>
                 <w:rFonts w:ascii="新細明體" w:hAnsi="新細明體" w:hint="eastAsia"/>
               </w:rPr>
-              <w:t>{{</w:t>
-            </w:r>
-            <w:proofErr w:type="spellStart"/>
-            <w:r>
-              <w:rPr>
-                <w:rFonts w:ascii="新細明體" w:hAnsi="新細明體" w:hint="eastAsia"/>
-              </w:rPr>
-              <w:t>promotionLeaflet</w:t>
-            </w:r>
-            <w:proofErr w:type="spellEnd"/>
-            <w:r>
-              <w:rPr>
-                <w:rFonts w:ascii="新細明體" w:hAnsi="新細明體" w:hint="eastAsia"/>
-              </w:rPr>
-              <w:t>}}宣傳單張  {{</w:t>
-            </w:r>
-            <w:proofErr w:type="spellStart"/>
-            <w:r>
-              <w:rPr>
-                <w:rFonts w:ascii="新細明體" w:hAnsi="新細明體" w:hint="eastAsia"/>
-              </w:rPr>
-              <w:t>promotionLuckyBox</w:t>
-            </w:r>
-            <w:proofErr w:type="spellEnd"/>
-            <w:r>
-              <w:rPr>
-                <w:rFonts w:ascii="新細明體" w:hAnsi="新細明體" w:hint="eastAsia"/>
-              </w:rPr>
-              <w:t>}}</w:t>
+              <w:t>{{promotionLeaflet}}宣傳單張  {{promotionLuckyBox}}</w:t>
             </w:r>
             <w:proofErr w:type="gramStart"/>
             <w:r>
@@ -3648,21 +2648,7 @@
               <w:rPr>
                 <w:rFonts w:ascii="新細明體" w:hAnsi="新細明體" w:hint="eastAsia"/>
               </w:rPr>
-              <w:t xml:space="preserve">  {{</w:t>
-            </w:r>
-            <w:proofErr w:type="spellStart"/>
-            <w:r>
-              <w:rPr>
-                <w:rFonts w:ascii="新細明體" w:hAnsi="新細明體" w:hint="eastAsia"/>
-              </w:rPr>
-              <w:t>promotionDisplayItem</w:t>
-            </w:r>
-            <w:proofErr w:type="spellEnd"/>
-            <w:r>
-              <w:rPr>
-                <w:rFonts w:ascii="新細明體" w:hAnsi="新細明體" w:hint="eastAsia"/>
-              </w:rPr>
-              <w:t>}}陳列品</w:t>
+              <w:t xml:space="preserve">  {{promotionDisplayItem}}陳列品</w:t>
             </w:r>
           </w:p>
           <w:p>
@@ -3675,21 +2661,7 @@
               <w:rPr>
                 <w:rFonts w:ascii="新細明體" w:hAnsi="新細明體" w:hint="eastAsia"/>
               </w:rPr>
-              <w:t>{{</w:t>
-            </w:r>
-            <w:proofErr w:type="spellStart"/>
-            <w:r>
-              <w:rPr>
-                <w:rFonts w:ascii="新細明體" w:hAnsi="新細明體" w:hint="eastAsia"/>
-              </w:rPr>
-              <w:t>promotionPromoter</w:t>
-            </w:r>
-            <w:proofErr w:type="spellEnd"/>
-            <w:r>
-              <w:rPr>
-                <w:rFonts w:ascii="新細明體" w:hAnsi="新細明體" w:hint="eastAsia"/>
-              </w:rPr>
-              <w:t>}}推廣員 (需另商議)</w:t>
+              <w:t>{{promotionPromoter}}推廣員 (需另商議)</w:t>
             </w:r>
           </w:p>
           <w:p>
@@ -3702,35 +2674,7 @@
               <w:rPr>
                 <w:rFonts w:ascii="新細明體" w:hAnsi="新細明體" w:hint="eastAsia"/>
               </w:rPr>
-              <w:t>{{</w:t>
-            </w:r>
-            <w:proofErr w:type="spellStart"/>
-            <w:r>
-              <w:rPr>
-                <w:rFonts w:ascii="新細明體" w:hAnsi="新細明體" w:hint="eastAsia"/>
-              </w:rPr>
-              <w:t>promotionOther</w:t>
-            </w:r>
-            <w:proofErr w:type="spellEnd"/>
-            <w:r>
-              <w:rPr>
-                <w:rFonts w:ascii="新細明體" w:hAnsi="新細明體" w:hint="eastAsia"/>
-              </w:rPr>
-              <w:t>}}其他: {{</w:t>
-            </w:r>
-            <w:proofErr w:type="spellStart"/>
-            <w:r>
-              <w:rPr>
-                <w:rFonts w:ascii="新細明體" w:hAnsi="新細明體" w:hint="eastAsia"/>
-              </w:rPr>
-              <w:t>promotionOtherText</w:t>
-            </w:r>
-            <w:proofErr w:type="spellEnd"/>
-            <w:r>
-              <w:rPr>
-                <w:rFonts w:ascii="新細明體" w:hAnsi="新細明體" w:hint="eastAsia"/>
-              </w:rPr>
-              <w:t>}}</w:t>
+              <w:t>{{promotionOther}}其他: {{promotionOtherText}}</w:t>
             </w:r>
           </w:p>
           <w:p>
@@ -3925,7 +2869,6 @@
           <w:rFonts w:ascii="新細明體" w:hAnsi="新細明體" w:hint="eastAsia"/>
           <w:bCs/>
         </w:rPr>
-        <w:lastRenderedPageBreak/>
         <w:t>出版社</w:t>
       </w:r>
       <w:r>
@@ -10210,76 +9153,76 @@
       </w:rPr>
     </w:lvl>
   </w:abstractNum>
-  <w:num w:numId="1" w16cid:durableId="2055226516">
+  <w:num w:numId="1" w16cid:durableId="1772118467">
     <w:abstractNumId w:val="13"/>
   </w:num>
-  <w:num w:numId="2" w16cid:durableId="656612102">
+  <w:num w:numId="2" w16cid:durableId="1307126291">
     <w:abstractNumId w:val="23"/>
   </w:num>
-  <w:num w:numId="3" w16cid:durableId="1782450184">
+  <w:num w:numId="3" w16cid:durableId="1557275455">
     <w:abstractNumId w:val="17"/>
   </w:num>
-  <w:num w:numId="4" w16cid:durableId="1548568913">
+  <w:num w:numId="4" w16cid:durableId="1907448540">
     <w:abstractNumId w:val="37"/>
   </w:num>
-  <w:num w:numId="5" w16cid:durableId="1589004325">
+  <w:num w:numId="5" w16cid:durableId="1670325816">
     <w:abstractNumId w:val="28"/>
   </w:num>
-  <w:num w:numId="6" w16cid:durableId="1831751296">
+  <w:num w:numId="6" w16cid:durableId="1684551487">
     <w:abstractNumId w:val="12"/>
   </w:num>
-  <w:num w:numId="7" w16cid:durableId="1350372749">
+  <w:num w:numId="7" w16cid:durableId="442190273">
     <w:abstractNumId w:val="1"/>
   </w:num>
-  <w:num w:numId="8" w16cid:durableId="196428089">
+  <w:num w:numId="8" w16cid:durableId="1031876675">
     <w:abstractNumId w:val="43"/>
   </w:num>
-  <w:num w:numId="9" w16cid:durableId="1530530301">
+  <w:num w:numId="9" w16cid:durableId="1012413005">
     <w:abstractNumId w:val="4"/>
   </w:num>
-  <w:num w:numId="10" w16cid:durableId="1478650136">
+  <w:num w:numId="10" w16cid:durableId="1975791796">
     <w:abstractNumId w:val="39"/>
   </w:num>
-  <w:num w:numId="11" w16cid:durableId="98766780">
+  <w:num w:numId="11" w16cid:durableId="580681580">
     <w:abstractNumId w:val="25"/>
   </w:num>
-  <w:num w:numId="12" w16cid:durableId="1598175384">
+  <w:num w:numId="12" w16cid:durableId="570845499">
     <w:abstractNumId w:val="18"/>
   </w:num>
-  <w:num w:numId="13" w16cid:durableId="1607032446">
+  <w:num w:numId="13" w16cid:durableId="1404638605">
     <w:abstractNumId w:val="45"/>
   </w:num>
-  <w:num w:numId="14" w16cid:durableId="1324356572">
+  <w:num w:numId="14" w16cid:durableId="1713573796">
     <w:abstractNumId w:val="31"/>
   </w:num>
-  <w:num w:numId="15" w16cid:durableId="50202509">
+  <w:num w:numId="15" w16cid:durableId="989210542">
     <w:abstractNumId w:val="16"/>
   </w:num>
-  <w:num w:numId="16" w16cid:durableId="1678196635">
+  <w:num w:numId="16" w16cid:durableId="52657201">
     <w:abstractNumId w:val="24"/>
   </w:num>
-  <w:num w:numId="17" w16cid:durableId="1808625975">
+  <w:num w:numId="17" w16cid:durableId="658968703">
     <w:abstractNumId w:val="35"/>
   </w:num>
-  <w:num w:numId="18" w16cid:durableId="391202167">
+  <w:num w:numId="18" w16cid:durableId="437221436">
     <w:abstractNumId w:val="38"/>
   </w:num>
-  <w:num w:numId="19" w16cid:durableId="987514152">
+  <w:num w:numId="19" w16cid:durableId="2036231528">
     <w:abstractNumId w:val="32"/>
   </w:num>
-  <w:num w:numId="20" w16cid:durableId="1273584938">
+  <w:num w:numId="20" w16cid:durableId="173040163">
     <w:abstractNumId w:val="36"/>
   </w:num>
-  <w:num w:numId="21" w16cid:durableId="1401752928">
+  <w:num w:numId="21" w16cid:durableId="314601817">
     <w:abstractNumId w:val="5"/>
   </w:num>
-  <w:num w:numId="22" w16cid:durableId="1120414839">
+  <w:num w:numId="22" w16cid:durableId="1162352874">
     <w:abstractNumId w:val="21"/>
   </w:num>
-  <w:num w:numId="23" w16cid:durableId="285818116">
+  <w:num w:numId="23" w16cid:durableId="246421933">
     <w:abstractNumId w:val="29"/>
   </w:num>
-  <w:num w:numId="24" w16cid:durableId="291180656">
+  <w:num w:numId="24" w16cid:durableId="1167015241">
     <w:abstractNumId w:val="0"/>
     <w:lvlOverride w:ilvl="0">
       <w:lvl w:ilvl="0">
@@ -10297,73 +9240,73 @@
       </w:lvl>
     </w:lvlOverride>
   </w:num>
-  <w:num w:numId="25" w16cid:durableId="1316228770">
+  <w:num w:numId="25" w16cid:durableId="1213424995">
     <w:abstractNumId w:val="6"/>
   </w:num>
-  <w:num w:numId="26" w16cid:durableId="13189982">
+  <w:num w:numId="26" w16cid:durableId="1292516492">
     <w:abstractNumId w:val="11"/>
   </w:num>
-  <w:num w:numId="27" w16cid:durableId="1042511238">
+  <w:num w:numId="27" w16cid:durableId="1988195881">
     <w:abstractNumId w:val="7"/>
   </w:num>
-  <w:num w:numId="28" w16cid:durableId="1467772812">
+  <w:num w:numId="28" w16cid:durableId="1132939667">
     <w:abstractNumId w:val="44"/>
   </w:num>
-  <w:num w:numId="29" w16cid:durableId="496650855">
+  <w:num w:numId="29" w16cid:durableId="1164392837">
     <w:abstractNumId w:val="19"/>
   </w:num>
-  <w:num w:numId="30" w16cid:durableId="289753101">
+  <w:num w:numId="30" w16cid:durableId="1966351084">
     <w:abstractNumId w:val="9"/>
   </w:num>
-  <w:num w:numId="31" w16cid:durableId="1413313685">
+  <w:num w:numId="31" w16cid:durableId="1721590386">
     <w:abstractNumId w:val="10"/>
   </w:num>
-  <w:num w:numId="32" w16cid:durableId="1434475372">
+  <w:num w:numId="32" w16cid:durableId="1857310841">
     <w:abstractNumId w:val="33"/>
   </w:num>
-  <w:num w:numId="33" w16cid:durableId="374431875">
+  <w:num w:numId="33" w16cid:durableId="1873378389">
     <w:abstractNumId w:val="27"/>
   </w:num>
-  <w:num w:numId="34" w16cid:durableId="1552422343">
+  <w:num w:numId="34" w16cid:durableId="596642962">
     <w:abstractNumId w:val="42"/>
   </w:num>
-  <w:num w:numId="35" w16cid:durableId="607085968">
+  <w:num w:numId="35" w16cid:durableId="2076656769">
     <w:abstractNumId w:val="22"/>
   </w:num>
-  <w:num w:numId="36" w16cid:durableId="591356179">
+  <w:num w:numId="36" w16cid:durableId="1077288472">
     <w:abstractNumId w:val="34"/>
   </w:num>
-  <w:num w:numId="37" w16cid:durableId="1876699208">
+  <w:num w:numId="37" w16cid:durableId="946472019">
     <w:abstractNumId w:val="40"/>
   </w:num>
-  <w:num w:numId="38" w16cid:durableId="216279114">
+  <w:num w:numId="38" w16cid:durableId="35278169">
     <w:abstractNumId w:val="15"/>
   </w:num>
-  <w:num w:numId="39" w16cid:durableId="1632441888">
+  <w:num w:numId="39" w16cid:durableId="168956531">
     <w:abstractNumId w:val="41"/>
   </w:num>
-  <w:num w:numId="40" w16cid:durableId="2131705773">
+  <w:num w:numId="40" w16cid:durableId="1856378402">
     <w:abstractNumId w:val="8"/>
   </w:num>
-  <w:num w:numId="41" w16cid:durableId="297993919">
+  <w:num w:numId="41" w16cid:durableId="1319000578">
     <w:abstractNumId w:val="3"/>
   </w:num>
-  <w:num w:numId="42" w16cid:durableId="198014021">
+  <w:num w:numId="42" w16cid:durableId="1213882868">
     <w:abstractNumId w:val="20"/>
   </w:num>
-  <w:num w:numId="43" w16cid:durableId="955988056">
+  <w:num w:numId="43" w16cid:durableId="112015782">
     <w:abstractNumId w:val="26"/>
   </w:num>
-  <w:num w:numId="44" w16cid:durableId="1424303100">
+  <w:num w:numId="44" w16cid:durableId="1586039349">
     <w:abstractNumId w:val="30"/>
   </w:num>
-  <w:num w:numId="45" w16cid:durableId="942611396">
+  <w:num w:numId="45" w16cid:durableId="908418898">
     <w:abstractNumId w:val="2"/>
   </w:num>
-  <w:num w:numId="46" w16cid:durableId="1995839431">
+  <w:num w:numId="46" w16cid:durableId="452600475">
     <w:abstractNumId w:val="46"/>
   </w:num>
-  <w:num w:numId="47" w16cid:durableId="1487895936">
+  <w:num w:numId="47" w16cid:durableId="1422217633">
     <w:abstractNumId w:val="14"/>
   </w:num>
 </w:numbering>

</xml_diff>